<commit_message>
feat: permiso registros.modificar (edicion y eliminacion novedades y cambios para Jefatura)
</commit_message>
<xml_diff>
--- a/Manual/Manual de uso.docx
+++ b/Manual/Manual de uso.docx
@@ -14729,6 +14729,28 @@
               <w:t>configurar</w:t>
             </w:r>
             <w:proofErr w:type="spellEnd"/>
+          </w:p>
+        </w:tc>
+      </w:tr>
+      <w:tr>
+        <w:tc>
+          <w:tcPr>
+            <w:tcW w:type="dxa" w:w="4320"/>
+          </w:tcPr>
+          <w:p>
+            <w:r>
+              <w:t>Registros</w:t>
+            </w:r>
+          </w:p>
+        </w:tc>
+        <w:tc>
+          <w:tcPr>
+            <w:tcW w:type="dxa" w:w="4320"/>
+          </w:tcPr>
+          <w:p>
+            <w:r>
+              <w:t>modificar</w:t>
+            </w:r>
           </w:p>
         </w:tc>
       </w:tr>

</xml_diff>

<commit_message>
fix: registros.modificar edita/elimina sin limite de tiempo y combobox Referencia estacion en editor
- registros.modificar salta editar_horas/eliminar_horas: gating en tables.py (botones) y bypass_window en records_service (actualizar/eliminar novedad y cambio).
- El editor de novedades/cambios renderiza referencia_estacion como combobox filtrable igual que el formulario de carga.
- AGENTS.md y Manual de uso.docx actualizados.
</commit_message>
<xml_diff>
--- a/Manual/Manual de uso.docx
+++ b/Manual/Manual de uso.docx
@@ -7067,360 +7067,7 @@
     </w:p>
     <w:p>
       <w:r>
-        <w:t xml:space="preserve">Haga doble </w:t>
-      </w:r>
-      <w:proofErr w:type="spellStart"/>
-      <w:r>
-        <w:t>clic</w:t>
-      </w:r>
-      <w:proofErr w:type="spellEnd"/>
-      <w:r>
-        <w:t xml:space="preserve"> </w:t>
-      </w:r>
-      <w:proofErr w:type="spellStart"/>
-      <w:r>
-        <w:t>sobre</w:t>
-      </w:r>
-      <w:proofErr w:type="spellEnd"/>
-      <w:r>
-        <w:t xml:space="preserve"> un </w:t>
-      </w:r>
-      <w:proofErr w:type="spellStart"/>
-      <w:r>
-        <w:t>registro</w:t>
-      </w:r>
-      <w:proofErr w:type="spellEnd"/>
-      <w:r>
-        <w:t xml:space="preserve"> para </w:t>
-      </w:r>
-      <w:proofErr w:type="spellStart"/>
-      <w:r>
-        <w:t>abrir</w:t>
-      </w:r>
-      <w:proofErr w:type="spellEnd"/>
-      <w:r>
-        <w:t xml:space="preserve"> el </w:t>
-      </w:r>
-      <w:proofErr w:type="spellStart"/>
-      <w:r>
-        <w:t>detalle</w:t>
-      </w:r>
-      <w:proofErr w:type="spellEnd"/>
-      <w:r>
-        <w:t xml:space="preserve"> </w:t>
-      </w:r>
-      <w:proofErr w:type="spellStart"/>
-      <w:r>
-        <w:t>completo</w:t>
-      </w:r>
-      <w:proofErr w:type="spellEnd"/>
-      <w:r>
-        <w:t xml:space="preserve">. Si el </w:t>
-      </w:r>
-      <w:proofErr w:type="spellStart"/>
-      <w:r>
-        <w:t>registro</w:t>
-      </w:r>
-      <w:proofErr w:type="spellEnd"/>
-      <w:r>
-        <w:t xml:space="preserve"> </w:t>
-      </w:r>
-      <w:proofErr w:type="spellStart"/>
-      <w:r>
-        <w:t>todavía</w:t>
-      </w:r>
-      <w:proofErr w:type="spellEnd"/>
-      <w:r>
-        <w:t xml:space="preserve"> </w:t>
-      </w:r>
-      <w:proofErr w:type="spellStart"/>
-      <w:r>
-        <w:t>está</w:t>
-      </w:r>
-      <w:proofErr w:type="spellEnd"/>
-      <w:r>
-        <w:t xml:space="preserve"> </w:t>
-      </w:r>
-      <w:proofErr w:type="spellStart"/>
-      <w:r>
-        <w:t>dentro</w:t>
-      </w:r>
-      <w:proofErr w:type="spellEnd"/>
-      <w:r>
-        <w:t xml:space="preserve"> de la </w:t>
-      </w:r>
-      <w:proofErr w:type="spellStart"/>
-      <w:r>
-        <w:t>ventana</w:t>
-      </w:r>
-      <w:proofErr w:type="spellEnd"/>
-      <w:r>
-        <w:t xml:space="preserve"> de </w:t>
-      </w:r>
-      <w:proofErr w:type="spellStart"/>
-      <w:r>
-        <w:t>edición</w:t>
-      </w:r>
-      <w:proofErr w:type="spellEnd"/>
-      <w:r>
-        <w:t xml:space="preserve"> </w:t>
-      </w:r>
-      <w:proofErr w:type="spellStart"/>
-      <w:r>
-        <w:t>permitida</w:t>
-      </w:r>
-      <w:proofErr w:type="spellEnd"/>
-      <w:r>
-        <w:t xml:space="preserve">, </w:t>
-      </w:r>
-      <w:proofErr w:type="spellStart"/>
-      <w:r>
-        <w:t>aparecen</w:t>
-      </w:r>
-      <w:proofErr w:type="spellEnd"/>
-      <w:r>
-        <w:t xml:space="preserve"> las </w:t>
-      </w:r>
-      <w:proofErr w:type="spellStart"/>
-      <w:r>
-        <w:t>opciones</w:t>
-      </w:r>
-      <w:proofErr w:type="spellEnd"/>
-      <w:r>
-        <w:t xml:space="preserve"> para </w:t>
-      </w:r>
-      <w:proofErr w:type="spellStart"/>
-      <w:r>
-        <w:t>editarlo</w:t>
-      </w:r>
-      <w:proofErr w:type="spellEnd"/>
-      <w:r>
-        <w:t xml:space="preserve"> o </w:t>
-      </w:r>
-      <w:proofErr w:type="spellStart"/>
-      <w:r>
-        <w:t>eliminarlo</w:t>
-      </w:r>
-      <w:proofErr w:type="spellEnd"/>
-      <w:r>
-        <w:t xml:space="preserve">. Por </w:t>
-      </w:r>
-      <w:proofErr w:type="spellStart"/>
-      <w:r>
-        <w:lastRenderedPageBreak/>
-        <w:t>defecto</w:t>
-      </w:r>
-      <w:proofErr w:type="spellEnd"/>
-      <w:r>
-        <w:t xml:space="preserve"> se </w:t>
-      </w:r>
-      <w:proofErr w:type="spellStart"/>
-      <w:r>
-        <w:t>puede</w:t>
-      </w:r>
-      <w:proofErr w:type="spellEnd"/>
-      <w:r>
-        <w:t xml:space="preserve"> </w:t>
-      </w:r>
-      <w:proofErr w:type="spellStart"/>
-      <w:r>
-        <w:t>editar</w:t>
-      </w:r>
-      <w:proofErr w:type="spellEnd"/>
-      <w:r>
-        <w:t xml:space="preserve"> </w:t>
-      </w:r>
-      <w:proofErr w:type="spellStart"/>
-      <w:r>
-        <w:t>dentro</w:t>
-      </w:r>
-      <w:proofErr w:type="spellEnd"/>
-      <w:r>
-        <w:t xml:space="preserve"> de las 24 horas y </w:t>
-      </w:r>
-      <w:proofErr w:type="spellStart"/>
-      <w:r>
-        <w:t>eliminar</w:t>
-      </w:r>
-      <w:proofErr w:type="spellEnd"/>
-      <w:r>
-        <w:t xml:space="preserve"> </w:t>
-      </w:r>
-      <w:proofErr w:type="spellStart"/>
-      <w:r>
-        <w:t>dentro</w:t>
-      </w:r>
-      <w:proofErr w:type="spellEnd"/>
-      <w:r>
-        <w:t xml:space="preserve"> de las 72 horas </w:t>
-      </w:r>
-      <w:proofErr w:type="spellStart"/>
-      <w:r>
-        <w:t>desde</w:t>
-      </w:r>
-      <w:proofErr w:type="spellEnd"/>
-      <w:r>
-        <w:t xml:space="preserve"> la </w:t>
-      </w:r>
-      <w:proofErr w:type="spellStart"/>
-      <w:r>
-        <w:t>creación</w:t>
-      </w:r>
-      <w:proofErr w:type="spellEnd"/>
-      <w:r>
-        <w:t xml:space="preserve"> (Administración → </w:t>
-      </w:r>
-      <w:proofErr w:type="spellStart"/>
-      <w:r>
-        <w:t>Tiempos</w:t>
-      </w:r>
-      <w:proofErr w:type="spellEnd"/>
-      <w:r>
-        <w:t xml:space="preserve"> de </w:t>
-      </w:r>
-      <w:proofErr w:type="spellStart"/>
-      <w:r>
-        <w:t>edición</w:t>
-      </w:r>
-      <w:proofErr w:type="spellEnd"/>
-      <w:r>
-        <w:t xml:space="preserve">). Los </w:t>
-      </w:r>
-      <w:proofErr w:type="spellStart"/>
-      <w:r>
-        <w:t>registros</w:t>
-      </w:r>
-      <w:proofErr w:type="spellEnd"/>
-      <w:r>
-        <w:t xml:space="preserve"> </w:t>
-      </w:r>
-      <w:proofErr w:type="spellStart"/>
-      <w:r>
-        <w:t>eliminados</w:t>
-      </w:r>
-      <w:proofErr w:type="spellEnd"/>
-      <w:r>
-        <w:t xml:space="preserve"> se </w:t>
-      </w:r>
-      <w:proofErr w:type="spellStart"/>
-      <w:r>
-        <w:t>pueden</w:t>
-      </w:r>
-      <w:proofErr w:type="spellEnd"/>
-      <w:r>
-        <w:t xml:space="preserve"> </w:t>
-      </w:r>
-      <w:proofErr w:type="spellStart"/>
-      <w:r>
-        <w:t>recuperar</w:t>
-      </w:r>
-      <w:proofErr w:type="spellEnd"/>
-      <w:r>
-        <w:t xml:space="preserve"> </w:t>
-      </w:r>
-      <w:proofErr w:type="spellStart"/>
-      <w:r>
-        <w:t>desde</w:t>
-      </w:r>
-      <w:proofErr w:type="spellEnd"/>
-      <w:r>
-        <w:t xml:space="preserve"> Administración → </w:t>
-      </w:r>
-      <w:proofErr w:type="spellStart"/>
-      <w:r>
-        <w:t>Registros</w:t>
-      </w:r>
-      <w:proofErr w:type="spellEnd"/>
-      <w:r>
-        <w:t xml:space="preserve"> </w:t>
-      </w:r>
-      <w:proofErr w:type="spellStart"/>
-      <w:r>
-        <w:t>eliminados</w:t>
-      </w:r>
-      <w:proofErr w:type="spellEnd"/>
-      <w:r>
-        <w:t xml:space="preserve">. El </w:t>
-      </w:r>
-      <w:proofErr w:type="spellStart"/>
-      <w:r>
-        <w:t>detalle</w:t>
-      </w:r>
-      <w:proofErr w:type="spellEnd"/>
-      <w:r>
-        <w:t xml:space="preserve"> </w:t>
-      </w:r>
-      <w:proofErr w:type="spellStart"/>
-      <w:r>
-        <w:t>incluye</w:t>
-      </w:r>
-      <w:proofErr w:type="spellEnd"/>
-      <w:r>
-        <w:t xml:space="preserve"> </w:t>
-      </w:r>
-      <w:proofErr w:type="spellStart"/>
-      <w:r>
-        <w:t>todos</w:t>
-      </w:r>
-      <w:proofErr w:type="spellEnd"/>
-      <w:r>
-        <w:t xml:space="preserve"> </w:t>
-      </w:r>
-      <w:proofErr w:type="spellStart"/>
-      <w:r>
-        <w:t>los</w:t>
-      </w:r>
-      <w:proofErr w:type="spellEnd"/>
-      <w:r>
-        <w:t xml:space="preserve"> </w:t>
-      </w:r>
-      <w:proofErr w:type="spellStart"/>
-      <w:r>
-        <w:t>datos</w:t>
-      </w:r>
-      <w:proofErr w:type="spellEnd"/>
-      <w:r>
-        <w:t xml:space="preserve"> del </w:t>
-      </w:r>
-      <w:proofErr w:type="spellStart"/>
-      <w:r>
-        <w:t>registro</w:t>
-      </w:r>
-      <w:proofErr w:type="spellEnd"/>
-      <w:r>
-        <w:t xml:space="preserve">, también las </w:t>
-      </w:r>
-      <w:proofErr w:type="spellStart"/>
-      <w:r>
-        <w:t>observaciones</w:t>
-      </w:r>
-      <w:proofErr w:type="spellEnd"/>
-      <w:r>
-        <w:t xml:space="preserve"> y el </w:t>
-      </w:r>
-      <w:proofErr w:type="spellStart"/>
-      <w:r>
-        <w:t>usuario</w:t>
-      </w:r>
-      <w:proofErr w:type="spellEnd"/>
-      <w:r>
-        <w:t xml:space="preserve"> de Windows </w:t>
-      </w:r>
-      <w:proofErr w:type="spellStart"/>
-      <w:r>
-        <w:t>que</w:t>
-      </w:r>
-      <w:proofErr w:type="spellEnd"/>
-      <w:r>
-        <w:t xml:space="preserve"> lo </w:t>
-      </w:r>
-      <w:proofErr w:type="spellStart"/>
-      <w:r>
-        <w:t>cargó</w:t>
-      </w:r>
-      <w:proofErr w:type="spellEnd"/>
-      <w:r>
-        <w:t>.</w:t>
+        <w:t>Haga doble clic sobre un registro para abrir el detalle completo. Si el registro todavia esta dentro de la ventana de edicion permitida, aparecen las opciones para editarlo o eliminarlo. Por defecto se puede editar dentro de las 24 horas y eliminar dentro de las 72 horas desde la creacion (Administracion - Tiempos de edicion). Los usuarios con el permiso Registros: modificar (Administrador y Jefatura) pueden editar y eliminar sin limite de tiempo. El formulario de edicion usa el mismo combobox filtrable de Referencia estacion que el formulario de carga. Los registros eliminados se pueden recuperar desde Administracion - Registros eliminados. El detalle incluye todos los datos del registro, tambien las observaciones y el usuario de Windows que lo cargo.</w:t>
       </w:r>
     </w:p>
     <w:p>
@@ -11398,191 +11045,7 @@
     </w:p>
     <w:p>
       <w:r>
-        <w:t xml:space="preserve">Tiempo de </w:t>
-      </w:r>
-      <w:proofErr w:type="spellStart"/>
-      <w:r>
-        <w:t>sesión</w:t>
-      </w:r>
-      <w:proofErr w:type="spellEnd"/>
-      <w:r>
-        <w:t xml:space="preserve">: </w:t>
-      </w:r>
-      <w:proofErr w:type="spellStart"/>
-      <w:r>
-        <w:t>minutos</w:t>
-      </w:r>
-      <w:proofErr w:type="spellEnd"/>
-      <w:r>
-        <w:t xml:space="preserve"> de </w:t>
-      </w:r>
-      <w:proofErr w:type="spellStart"/>
-      <w:r>
-        <w:t>inactividad</w:t>
-      </w:r>
-      <w:proofErr w:type="spellEnd"/>
-      <w:r>
-        <w:t xml:space="preserve"> antes de </w:t>
-      </w:r>
-      <w:proofErr w:type="spellStart"/>
-      <w:r>
-        <w:t>cerrar</w:t>
-      </w:r>
-      <w:proofErr w:type="spellEnd"/>
-      <w:r>
-        <w:t xml:space="preserve"> la </w:t>
-      </w:r>
-      <w:proofErr w:type="spellStart"/>
-      <w:r>
-        <w:t>sesión</w:t>
-      </w:r>
-      <w:proofErr w:type="spellEnd"/>
-      <w:r>
-        <w:t xml:space="preserve"> (</w:t>
-      </w:r>
-      <w:proofErr w:type="spellStart"/>
-      <w:r>
-        <w:t>por</w:t>
-      </w:r>
-      <w:proofErr w:type="spellEnd"/>
-      <w:r>
-        <w:t xml:space="preserve"> </w:t>
-      </w:r>
-      <w:proofErr w:type="spellStart"/>
-      <w:r>
-        <w:t>defecto</w:t>
-      </w:r>
-      <w:proofErr w:type="spellEnd"/>
-      <w:r>
-        <w:t xml:space="preserve"> 30). </w:t>
-      </w:r>
-      <w:proofErr w:type="spellStart"/>
-      <w:r>
-        <w:t>Tiempos</w:t>
-      </w:r>
-      <w:proofErr w:type="spellEnd"/>
-      <w:r>
-        <w:t xml:space="preserve"> de </w:t>
-      </w:r>
-      <w:proofErr w:type="spellStart"/>
-      <w:r>
-        <w:t>edición</w:t>
-      </w:r>
-      <w:proofErr w:type="spellEnd"/>
-      <w:r>
-        <w:t xml:space="preserve">: horas </w:t>
-      </w:r>
-      <w:proofErr w:type="spellStart"/>
-      <w:r>
-        <w:t>permitidas</w:t>
-      </w:r>
-      <w:proofErr w:type="spellEnd"/>
-      <w:r>
-        <w:t xml:space="preserve"> para </w:t>
-      </w:r>
-      <w:proofErr w:type="spellStart"/>
-      <w:r>
-        <w:t>editar</w:t>
-      </w:r>
-      <w:proofErr w:type="spellEnd"/>
-      <w:r>
-        <w:t xml:space="preserve"> (24) y </w:t>
-      </w:r>
-      <w:proofErr w:type="spellStart"/>
-      <w:r>
-        <w:t>eliminar</w:t>
-      </w:r>
-      <w:proofErr w:type="spellEnd"/>
-      <w:r>
-        <w:t xml:space="preserve"> (72) un </w:t>
-      </w:r>
-      <w:proofErr w:type="spellStart"/>
-      <w:r>
-        <w:t>registro</w:t>
-      </w:r>
-      <w:proofErr w:type="spellEnd"/>
-      <w:r>
-        <w:t xml:space="preserve"> </w:t>
-      </w:r>
-      <w:proofErr w:type="spellStart"/>
-      <w:r>
-        <w:t>desde</w:t>
-      </w:r>
-      <w:proofErr w:type="spellEnd"/>
-      <w:r>
-        <w:t xml:space="preserve"> </w:t>
-      </w:r>
-      <w:proofErr w:type="spellStart"/>
-      <w:r>
-        <w:t>su</w:t>
-      </w:r>
-      <w:proofErr w:type="spellEnd"/>
-      <w:r>
-        <w:t xml:space="preserve"> </w:t>
-      </w:r>
-      <w:proofErr w:type="spellStart"/>
-      <w:r>
-        <w:t>creación</w:t>
-      </w:r>
-      <w:proofErr w:type="spellEnd"/>
-      <w:r>
-        <w:t xml:space="preserve">. También se </w:t>
-      </w:r>
-      <w:proofErr w:type="spellStart"/>
-      <w:r>
-        <w:t>configura</w:t>
-      </w:r>
-      <w:proofErr w:type="spellEnd"/>
-      <w:r>
-        <w:t xml:space="preserve"> la </w:t>
-      </w:r>
-      <w:proofErr w:type="spellStart"/>
-      <w:r>
-        <w:t>altura</w:t>
-      </w:r>
-      <w:proofErr w:type="spellEnd"/>
-      <w:r>
-        <w:t xml:space="preserve"> de las </w:t>
-      </w:r>
-      <w:proofErr w:type="spellStart"/>
-      <w:r>
-        <w:t>filas</w:t>
-      </w:r>
-      <w:proofErr w:type="spellEnd"/>
-      <w:r>
-        <w:t xml:space="preserve"> de las </w:t>
-      </w:r>
-      <w:proofErr w:type="spellStart"/>
-      <w:r>
-        <w:t>tablas</w:t>
-      </w:r>
-      <w:proofErr w:type="spellEnd"/>
-      <w:r>
-        <w:t xml:space="preserve"> (1-60 </w:t>
-      </w:r>
-      <w:proofErr w:type="spellStart"/>
-      <w:r>
-        <w:t>píxeles</w:t>
-      </w:r>
-      <w:proofErr w:type="spellEnd"/>
-      <w:r>
-        <w:t xml:space="preserve">, </w:t>
-      </w:r>
-      <w:proofErr w:type="spellStart"/>
-      <w:r>
-        <w:t>por</w:t>
-      </w:r>
-      <w:proofErr w:type="spellEnd"/>
-      <w:r>
-        <w:t xml:space="preserve"> </w:t>
-      </w:r>
-      <w:proofErr w:type="spellStart"/>
-      <w:r>
-        <w:t>defecto</w:t>
-      </w:r>
-      <w:proofErr w:type="spellEnd"/>
-      <w:r>
-        <w:t xml:space="preserve"> 30).</w:t>
+        <w:t>Tiempo de sesion: minutos de inactividad antes de cerrar la sesion (por defecto 30). Tiempos de edicion: horas permitidas para editar (24) y eliminar (72) un registro desde su creacion. Tambien se configura la altura de las filas de las tablas (1-60 pixeles, por defecto 30). Los usuarios con el permiso Registros: modificar (Administrador, Jefatura) pueden editar y eliminar sin limite de tiempo.</w:t>
       </w:r>
     </w:p>
     <w:p>
@@ -13508,80 +12971,8 @@
             <w:tcW w:w="4320" w:type="dxa"/>
           </w:tcPr>
           <w:p>
-            <w:pPr>
-              <w:cnfStyle w:val="000000010000" w:firstRow="0" w:lastRow="0" w:firstColumn="0" w:lastColumn="0" w:oddVBand="0" w:evenVBand="0" w:oddHBand="0" w:evenHBand="1" w:firstRowFirstColumn="0" w:firstRowLastColumn="0" w:lastRowFirstColumn="0" w:lastRowLastColumn="0"/>
-            </w:pPr>
-            <w:proofErr w:type="spellStart"/>
-            <w:r>
-              <w:t>Superó</w:t>
-            </w:r>
-            <w:proofErr w:type="spellEnd"/>
-            <w:r>
-              <w:t xml:space="preserve"> la </w:t>
-            </w:r>
-            <w:proofErr w:type="spellStart"/>
-            <w:r>
-              <w:t>ventana</w:t>
-            </w:r>
-            <w:proofErr w:type="spellEnd"/>
-            <w:r>
-              <w:t xml:space="preserve"> de horas </w:t>
-            </w:r>
-            <w:proofErr w:type="spellStart"/>
-            <w:r>
-              <w:t>permitida</w:t>
-            </w:r>
-            <w:proofErr w:type="spellEnd"/>
-            <w:r>
-              <w:t xml:space="preserve"> (</w:t>
-            </w:r>
-            <w:proofErr w:type="spellStart"/>
-            <w:r>
-              <w:t>Tiempos</w:t>
-            </w:r>
-            <w:proofErr w:type="spellEnd"/>
-            <w:r>
-              <w:t xml:space="preserve"> de </w:t>
-            </w:r>
-            <w:proofErr w:type="spellStart"/>
-            <w:r>
-              <w:t>edición</w:t>
-            </w:r>
-            <w:proofErr w:type="spellEnd"/>
-            <w:r>
-              <w:t xml:space="preserve">) o </w:t>
-            </w:r>
-            <w:proofErr w:type="spellStart"/>
-            <w:r>
-              <w:t>su</w:t>
-            </w:r>
-            <w:proofErr w:type="spellEnd"/>
-            <w:r>
-              <w:t xml:space="preserve"> </w:t>
-            </w:r>
-            <w:proofErr w:type="spellStart"/>
-            <w:r>
-              <w:t>rol</w:t>
-            </w:r>
-            <w:proofErr w:type="spellEnd"/>
-            <w:r>
-              <w:t xml:space="preserve"> no </w:t>
-            </w:r>
-            <w:proofErr w:type="spellStart"/>
-            <w:r>
-              <w:t>tiene</w:t>
-            </w:r>
-            <w:proofErr w:type="spellEnd"/>
-            <w:r>
-              <w:t xml:space="preserve"> </w:t>
-            </w:r>
-            <w:proofErr w:type="spellStart"/>
-            <w:r>
-              <w:t>permiso</w:t>
-            </w:r>
-            <w:proofErr w:type="spellEnd"/>
-            <w:r>
-              <w:t>.</w:t>
+            <w:r>
+              <w:t>Supero la ventana de horas permitida (Tiempos de edicion) o su rol no tiene permiso. Los usuarios con el permiso Registros: modificar no tienen limite de tiempo.</w:t>
             </w:r>
           </w:p>
         </w:tc>

</xml_diff>